<commit_message>
Align the Lab docs and About with the senior Data foundation, without inventing extra jobs.
Co-authored-by: Cursor <cursoragent@cursor.com>
</commit_message>
<xml_diff>
--- a/docs/source/01_AI_Data_Lab_Vision_Architecture.docx
+++ b/docs/source/01_AI_Data_Lab_Vision_Architecture.docx
@@ -42,6 +42,8 @@
       <w:tr>
         <w:trPr>
           <w:trHeight w:val="60" w:hRule="exact"/>
+          <w:cantSplit/>
+          <w:tblHeader/>
         </w:trPr>
         <w:tc>
           <w:tcPr>
@@ -61,7 +63,7 @@
         <w:shd w:fill="EAF2F7"/>
       </w:pPr>
       <w:r>
-        <w:t>Positionnement : Data -&gt; AI Agents -&gt; Physical AI / Robotics, avec des domaines adjacents uniquement lorsqu’ils servent l’histoire technique.</w:t>
+        <w:t>Positionnement : une expérience professionnelle Data déjà solide (~10 ans) comme socle, puis une montée en puissance vers AI Engineering / AI Agents -&gt; Physical AI / Robotics. Les domaines adjacents ne sont visibles que lorsqu’ils servent cette histoire technique.</w:t>
       </w:r>
     </w:p>
     <w:p>
@@ -412,6 +414,7 @@
       <w:tr>
         <w:trPr>
           <w:tblHeader w:val="true"/>
+          <w:cantSplit/>
         </w:trPr>
         <w:tc>
           <w:tcPr>
@@ -520,6 +523,9 @@
         </w:tc>
       </w:tr>
       <w:tr>
+        <w:trPr>
+          <w:cantSplit/>
+        </w:trPr>
         <w:tc>
           <w:tcPr>
             <w:tcW w:type="dxa" w:w="3389"/>
@@ -621,6 +627,9 @@
         </w:tc>
       </w:tr>
       <w:tr>
+        <w:trPr>
+          <w:cantSplit/>
+        </w:trPr>
         <w:tc>
           <w:tcPr>
             <w:tcW w:type="dxa" w:w="3389"/>
@@ -725,6 +734,9 @@
         </w:tc>
       </w:tr>
       <w:tr>
+        <w:trPr>
+          <w:cantSplit/>
+        </w:trPr>
         <w:tc>
           <w:tcPr>
             <w:tcW w:type="dxa" w:w="3389"/>
@@ -832,6 +844,20 @@
       </w:pPr>
     </w:p>
     <w:p>
+      <w:pPr/>
+      <w:r>
+        <w:t>Le visiteur doit comprendre deux choses en quelques secondes : il ne s’agit pas d’un profil junior qui découvre la Data, mais d’un professionnel expérimenté qui capitalise sur environ dix ans de pratique Data ; et les Labs/projets montrent la trajectoire actuelle vers les systèmes agentiques et physiques.</w:t>
+      </w:r>
+    </w:p>
+    <w:p>
+      <w:pPr>
+        <w:pStyle w:val="Callout"/>
+      </w:pPr>
+      <w:r>
+        <w:t>Socle professionnel -&gt; preuves Data réelles -&gt; expérimentation AI/Agents -&gt; nouvelles preuves -&gt; Physical AI / Robotics</w:t>
+      </w:r>
+    </w:p>
+    <w:p>
       <w:r>
         <w:t>Boucle de création de valeur :</w:t>
       </w:r>
@@ -879,6 +905,76 @@
         <w:pStyle w:val="Heading2"/>
       </w:pPr>
       <w:r>
+        <w:t>Socle professionnel à préserver</w:t>
+      </w:r>
+    </w:p>
+    <w:p>
+      <w:pPr/>
+      <w:r>
+        <w:t>Le site doit rendre l’expérience professionnelle visible sans redevenir un CV en ligne. Elle sert de point de départ et de preuve de maturité : les projets IA viennent prolonger cette base, pas la remplacer.</w:t>
+      </w:r>
+    </w:p>
+    <w:p>
+      <w:pPr>
+        <w:pStyle w:val="ListBullet"/>
+      </w:pPr>
+      <w:r>
+        <w:t>Environ 10 ans d’expérience en Data Analyst / Data Scientist / Senior Data Analyst, dans des contextes variés incluant secteur public, banque et retail.</w:t>
+      </w:r>
+    </w:p>
+    <w:p>
+      <w:pPr>
+        <w:pStyle w:val="ListBullet"/>
+      </w:pPr>
+      <w:r>
+        <w:t>Expérience de bout en bout : compréhension du besoin, préparation/ETL, analyse, machine learning selon les cas, restitution et dashboards.</w:t>
+      </w:r>
+    </w:p>
+    <w:p>
+      <w:pPr>
+        <w:pStyle w:val="ListBullet"/>
+      </w:pPr>
+      <w:r>
+        <w:t>Exposition à la Data Strategy, Data Management, Data Governance et Data Culture ; ces dimensions doivent rester visibles car elles différencient un profil senior d’un portfolio purement technique.</w:t>
+      </w:r>
+    </w:p>
+    <w:p>
+      <w:pPr>
+        <w:pStyle w:val="ListBullet"/>
+      </w:pPr>
+      <w:r>
+        <w:t>Expérience de management de petites équipes (2 à 3 personnes chez Ipsos, notamment juniors/alternants) à présenter comme expérience réelle de coordination et d’accompagnement.</w:t>
+      </w:r>
+    </w:p>
+    <w:p>
+      <w:pPr>
+        <w:pStyle w:val="ListBullet"/>
+      </w:pPr>
+      <w:r>
+        <w:t>Stack professionnelle à montrer de manière sélective : Python, SQL, Power BI et autres outils BI/data réellement utilisés, sans transformer la page en nuage de logos.</w:t>
+      </w:r>
+    </w:p>
+    <w:p>
+      <w:pPr>
+        <w:pStyle w:val="ListBullet"/>
+      </w:pPr>
+      <w:r>
+        <w:t>Formation Alyra en développement Ethereum : Solidity et smart contracts. La présenter explicitement comme formation/projets, sans la convertir en expérience professionnelle blockchain.</w:t>
+      </w:r>
+    </w:p>
+    <w:p>
+      <w:pPr>
+        <w:pStyle w:val="Callout"/>
+      </w:pPr>
+      <w:r>
+        <w:t>Principe narratif : “Experienced Data professional building toward intelligent systems”, et non “aspiring AI engineer starting from zero”.</w:t>
+      </w:r>
+    </w:p>
+    <w:p>
+      <w:pPr>
+        <w:pStyle w:val="Heading2"/>
+      </w:pPr>
+      <w:r>
         <w:t>Règle éditoriale</w:t>
       </w:r>
     </w:p>
@@ -906,6 +1002,7 @@
       <w:tr>
         <w:trPr>
           <w:tblHeader w:val="true"/>
+          <w:cantSplit/>
         </w:trPr>
         <w:tc>
           <w:tcPr>
@@ -1014,6 +1111,9 @@
         </w:tc>
       </w:tr>
       <w:tr>
+        <w:trPr>
+          <w:cantSplit/>
+        </w:trPr>
         <w:tc>
           <w:tcPr>
             <w:tcW w:type="dxa" w:w="3389"/>
@@ -1115,6 +1215,9 @@
         </w:tc>
       </w:tr>
       <w:tr>
+        <w:trPr>
+          <w:cantSplit/>
+        </w:trPr>
         <w:tc>
           <w:tcPr>
             <w:tcW w:type="dxa" w:w="3389"/>
@@ -1219,6 +1322,9 @@
         </w:tc>
       </w:tr>
       <w:tr>
+        <w:trPr>
+          <w:cantSplit/>
+        </w:trPr>
         <w:tc>
           <w:tcPr>
             <w:tcW w:type="dxa" w:w="3389"/>
@@ -1349,6 +1455,7 @@
       <w:tr>
         <w:trPr>
           <w:tblHeader w:val="true"/>
+          <w:cantSplit/>
         </w:trPr>
         <w:tc>
           <w:tcPr>
@@ -1492,6 +1599,9 @@
         </w:tc>
       </w:tr>
       <w:tr>
+        <w:trPr>
+          <w:cantSplit/>
+        </w:trPr>
         <w:tc>
           <w:tcPr>
             <w:tcW w:type="dxa" w:w="2541"/>
@@ -1626,6 +1736,9 @@
         </w:tc>
       </w:tr>
       <w:tr>
+        <w:trPr>
+          <w:cantSplit/>
+        </w:trPr>
         <w:tc>
           <w:tcPr>
             <w:tcW w:type="dxa" w:w="2541"/>
@@ -1764,6 +1877,9 @@
         </w:tc>
       </w:tr>
       <w:tr>
+        <w:trPr>
+          <w:cantSplit/>
+        </w:trPr>
         <w:tc>
           <w:tcPr>
             <w:tcW w:type="dxa" w:w="2541"/>
@@ -1904,8 +2020,17 @@
       </w:pPr>
     </w:p>
     <w:p>
+      <w:pPr/>
       <w:r>
-        <w:t>Le CV devient un composant du système, pas son centre. La homepage doit d’abord montrer ce qui est construit, observé, appris et mesuré.</w:t>
+        <w:t>Le CV n’est pas le centre du système, mais l’expérience ne doit jamais disparaître. La homepage doit combiner un résumé professionnel très lisible avec les preuves récentes : projets, Labs, articles, évaluations et signaux observés.</w:t>
+      </w:r>
+    </w:p>
+    <w:p>
+      <w:pPr>
+        <w:pStyle w:val="Callout"/>
+      </w:pPr>
+      <w:r>
+        <w:t>Une page dédiée EXPERIENCE / PARCOURS doit faire partie de la V1. Elle rassemble timeline, contextes de mission, responsabilités, impacts, management et credentials. Les pages Projects/Labs prouvent ensuite l’évolution actuelle vers l’IA.</w:t>
       </w:r>
     </w:p>
     <w:p>
@@ -1931,6 +2056,7 @@
       <w:tr>
         <w:trPr>
           <w:tblHeader w:val="true"/>
+          <w:cantSplit/>
         </w:trPr>
         <w:tc>
           <w:tcPr>
@@ -2039,6 +2165,9 @@
         </w:tc>
       </w:tr>
       <w:tr>
+        <w:trPr>
+          <w:cantSplit/>
+        </w:trPr>
         <w:tc>
           <w:tcPr>
             <w:tcW w:type="dxa" w:w="3389"/>
@@ -2140,6 +2269,9 @@
         </w:tc>
       </w:tr>
       <w:tr>
+        <w:trPr>
+          <w:cantSplit/>
+        </w:trPr>
         <w:tc>
           <w:tcPr>
             <w:tcW w:type="dxa" w:w="3389"/>
@@ -2244,6 +2376,9 @@
         </w:tc>
       </w:tr>
       <w:tr>
+        <w:trPr>
+          <w:cantSplit/>
+        </w:trPr>
         <w:tc>
           <w:tcPr>
             <w:tcW w:type="dxa" w:w="3389"/>
@@ -2345,6 +2480,9 @@
         </w:tc>
       </w:tr>
       <w:tr>
+        <w:trPr>
+          <w:cantSplit/>
+        </w:trPr>
         <w:tc>
           <w:tcPr>
             <w:tcW w:type="dxa" w:w="3389"/>
@@ -2449,6 +2587,9 @@
         </w:tc>
       </w:tr>
       <w:tr>
+        <w:trPr>
+          <w:cantSplit/>
+        </w:trPr>
         <w:tc>
           <w:tcPr>
             <w:tcW w:type="dxa" w:w="3389"/>
@@ -2550,6 +2691,9 @@
         </w:tc>
       </w:tr>
       <w:tr>
+        <w:trPr>
+          <w:cantSplit/>
+        </w:trPr>
         <w:tc>
           <w:tcPr>
             <w:tcW w:type="dxa" w:w="3389"/>
@@ -2654,6 +2798,9 @@
         </w:tc>
       </w:tr>
       <w:tr>
+        <w:trPr>
+          <w:cantSplit/>
+        </w:trPr>
         <w:tc>
           <w:tcPr>
             <w:tcW w:type="dxa" w:w="3389"/>
@@ -2755,6 +2902,9 @@
         </w:tc>
       </w:tr>
       <w:tr>
+        <w:trPr>
+          <w:cantSplit/>
+        </w:trPr>
         <w:tc>
           <w:tcPr>
             <w:tcW w:type="dxa" w:w="3389"/>
@@ -2892,6 +3042,7 @@
       <w:tr>
         <w:trPr>
           <w:tblHeader w:val="true"/>
+          <w:cantSplit/>
         </w:trPr>
         <w:tc>
           <w:tcPr>
@@ -3000,6 +3151,9 @@
         </w:tc>
       </w:tr>
       <w:tr>
+        <w:trPr>
+          <w:cantSplit/>
+        </w:trPr>
         <w:tc>
           <w:tcPr>
             <w:tcW w:type="dxa" w:w="3389"/>
@@ -3101,6 +3255,9 @@
         </w:tc>
       </w:tr>
       <w:tr>
+        <w:trPr>
+          <w:cantSplit/>
+        </w:trPr>
         <w:tc>
           <w:tcPr>
             <w:tcW w:type="dxa" w:w="3389"/>
@@ -3205,6 +3362,9 @@
         </w:tc>
       </w:tr>
       <w:tr>
+        <w:trPr>
+          <w:cantSplit/>
+        </w:trPr>
         <w:tc>
           <w:tcPr>
             <w:tcW w:type="dxa" w:w="3389"/>
@@ -3306,6 +3466,9 @@
         </w:tc>
       </w:tr>
       <w:tr>
+        <w:trPr>
+          <w:cantSplit/>
+        </w:trPr>
         <w:tc>
           <w:tcPr>
             <w:tcW w:type="dxa" w:w="3389"/>
@@ -3410,6 +3573,9 @@
         </w:tc>
       </w:tr>
       <w:tr>
+        <w:trPr>
+          <w:cantSplit/>
+        </w:trPr>
         <w:tc>
           <w:tcPr>
             <w:tcW w:type="dxa" w:w="3389"/>
@@ -3515,6 +3681,12 @@
       <w:pPr>
         <w:spacing w:after="0"/>
       </w:pPr>
+    </w:p>
+    <w:p>
+      <w:pPr/>
+      <w:r>
+        <w:t>Pour un recruteur, l’ordre de lecture recommandé est : 10 ans de socle Data -&gt; responsabilités et contextes -&gt; 3 preuves/projets pertinents -&gt; compétences émergentes -&gt; CV/contact. Pour un ingénieur, l’ordre peut inverser Projects/Lab et Experience.</w:t>
+      </w:r>
     </w:p>
     <w:p>
       <w:r>
@@ -3663,6 +3835,7 @@
       <w:tr>
         <w:trPr>
           <w:tblHeader w:val="true"/>
+          <w:cantSplit/>
         </w:trPr>
         <w:tc>
           <w:tcPr>
@@ -3771,6 +3944,9 @@
         </w:tc>
       </w:tr>
       <w:tr>
+        <w:trPr>
+          <w:cantSplit/>
+        </w:trPr>
         <w:tc>
           <w:tcPr>
             <w:tcW w:type="dxa" w:w="3389"/>
@@ -3872,6 +4048,9 @@
         </w:tc>
       </w:tr>
       <w:tr>
+        <w:trPr>
+          <w:cantSplit/>
+        </w:trPr>
         <w:tc>
           <w:tcPr>
             <w:tcW w:type="dxa" w:w="3389"/>
@@ -3976,6 +4155,9 @@
         </w:tc>
       </w:tr>
       <w:tr>
+        <w:trPr>
+          <w:cantSplit/>
+        </w:trPr>
         <w:tc>
           <w:tcPr>
             <w:tcW w:type="dxa" w:w="3389"/>
@@ -4077,6 +4259,9 @@
         </w:tc>
       </w:tr>
       <w:tr>
+        <w:trPr>
+          <w:cantSplit/>
+        </w:trPr>
         <w:tc>
           <w:tcPr>
             <w:tcW w:type="dxa" w:w="3389"/>
@@ -4181,6 +4366,9 @@
         </w:tc>
       </w:tr>
       <w:tr>
+        <w:trPr>
+          <w:cantSplit/>
+        </w:trPr>
         <w:tc>
           <w:tcPr>
             <w:tcW w:type="dxa" w:w="3389"/>
@@ -4282,6 +4470,9 @@
         </w:tc>
       </w:tr>
       <w:tr>
+        <w:trPr>
+          <w:cantSplit/>
+        </w:trPr>
         <w:tc>
           <w:tcPr>
             <w:tcW w:type="dxa" w:w="3389"/>
@@ -4386,6 +4577,9 @@
         </w:tc>
       </w:tr>
       <w:tr>
+        <w:trPr>
+          <w:cantSplit/>
+        </w:trPr>
         <w:tc>
           <w:tcPr>
             <w:tcW w:type="dxa" w:w="3389"/>
@@ -4514,6 +4708,7 @@
       <w:tr>
         <w:trPr>
           <w:tblHeader w:val="true"/>
+          <w:cantSplit/>
         </w:trPr>
         <w:tc>
           <w:tcPr>
@@ -4587,6 +4782,9 @@
         </w:tc>
       </w:tr>
       <w:tr>
+        <w:trPr>
+          <w:cantSplit/>
+        </w:trPr>
         <w:tc>
           <w:tcPr>
             <w:tcW w:type="dxa" w:w="5083"/>
@@ -4655,6 +4853,9 @@
         </w:tc>
       </w:tr>
       <w:tr>
+        <w:trPr>
+          <w:cantSplit/>
+        </w:trPr>
         <w:tc>
           <w:tcPr>
             <w:tcW w:type="dxa" w:w="5083"/>
@@ -4725,6 +4926,9 @@
         </w:tc>
       </w:tr>
       <w:tr>
+        <w:trPr>
+          <w:cantSplit/>
+        </w:trPr>
         <w:tc>
           <w:tcPr>
             <w:tcW w:type="dxa" w:w="5083"/>
@@ -4793,6 +4997,9 @@
         </w:tc>
       </w:tr>
       <w:tr>
+        <w:trPr>
+          <w:cantSplit/>
+        </w:trPr>
         <w:tc>
           <w:tcPr>
             <w:tcW w:type="dxa" w:w="5083"/>
@@ -4863,6 +5070,9 @@
         </w:tc>
       </w:tr>
       <w:tr>
+        <w:trPr>
+          <w:cantSplit/>
+        </w:trPr>
         <w:tc>
           <w:tcPr>
             <w:tcW w:type="dxa" w:w="5083"/>
@@ -4931,6 +5141,9 @@
         </w:tc>
       </w:tr>
       <w:tr>
+        <w:trPr>
+          <w:cantSplit/>
+        </w:trPr>
         <w:tc>
           <w:tcPr>
             <w:tcW w:type="dxa" w:w="5083"/>
@@ -5001,6 +5214,9 @@
         </w:tc>
       </w:tr>
       <w:tr>
+        <w:trPr>
+          <w:cantSplit/>
+        </w:trPr>
         <w:tc>
           <w:tcPr>
             <w:tcW w:type="dxa" w:w="5083"/>
@@ -5069,6 +5285,9 @@
         </w:tc>
       </w:tr>
       <w:tr>
+        <w:trPr>
+          <w:cantSplit/>
+        </w:trPr>
         <w:tc>
           <w:tcPr>
             <w:tcW w:type="dxa" w:w="5083"/>
@@ -5139,6 +5358,9 @@
         </w:tc>
       </w:tr>
       <w:tr>
+        <w:trPr>
+          <w:cantSplit/>
+        </w:trPr>
         <w:tc>
           <w:tcPr>
             <w:tcW w:type="dxa" w:w="5083"/>
@@ -5207,6 +5429,9 @@
         </w:tc>
       </w:tr>
       <w:tr>
+        <w:trPr>
+          <w:cantSplit/>
+        </w:trPr>
         <w:tc>
           <w:tcPr>
             <w:tcW w:type="dxa" w:w="5083"/>
@@ -5277,6 +5502,9 @@
         </w:tc>
       </w:tr>
       <w:tr>
+        <w:trPr>
+          <w:cantSplit/>
+        </w:trPr>
         <w:tc>
           <w:tcPr>
             <w:tcW w:type="dxa" w:w="5083"/>
@@ -5345,6 +5573,9 @@
         </w:tc>
       </w:tr>
       <w:tr>
+        <w:trPr>
+          <w:cantSplit/>
+        </w:trPr>
         <w:tc>
           <w:tcPr>
             <w:tcW w:type="dxa" w:w="5083"/>
@@ -5540,6 +5771,7 @@
       <w:tr>
         <w:trPr>
           <w:tblHeader w:val="true"/>
+          <w:cantSplit/>
         </w:trPr>
         <w:tc>
           <w:tcPr>
@@ -5613,6 +5845,9 @@
         </w:tc>
       </w:tr>
       <w:tr>
+        <w:trPr>
+          <w:cantSplit/>
+        </w:trPr>
         <w:tc>
           <w:tcPr>
             <w:tcW w:type="dxa" w:w="5083"/>
@@ -5681,6 +5916,9 @@
         </w:tc>
       </w:tr>
       <w:tr>
+        <w:trPr>
+          <w:cantSplit/>
+        </w:trPr>
         <w:tc>
           <w:tcPr>
             <w:tcW w:type="dxa" w:w="5083"/>
@@ -5751,6 +5989,9 @@
         </w:tc>
       </w:tr>
       <w:tr>
+        <w:trPr>
+          <w:cantSplit/>
+        </w:trPr>
         <w:tc>
           <w:tcPr>
             <w:tcW w:type="dxa" w:w="5083"/>
@@ -5819,6 +6060,9 @@
         </w:tc>
       </w:tr>
       <w:tr>
+        <w:trPr>
+          <w:cantSplit/>
+        </w:trPr>
         <w:tc>
           <w:tcPr>
             <w:tcW w:type="dxa" w:w="5083"/>
@@ -5889,6 +6133,9 @@
         </w:tc>
       </w:tr>
       <w:tr>
+        <w:trPr>
+          <w:cantSplit/>
+        </w:trPr>
         <w:tc>
           <w:tcPr>
             <w:tcW w:type="dxa" w:w="5083"/>
@@ -5957,6 +6204,9 @@
         </w:tc>
       </w:tr>
       <w:tr>
+        <w:trPr>
+          <w:cantSplit/>
+        </w:trPr>
         <w:tc>
           <w:tcPr>
             <w:tcW w:type="dxa" w:w="5083"/>
@@ -6109,6 +6359,7 @@
       <w:tr>
         <w:trPr>
           <w:tblHeader w:val="true"/>
+          <w:cantSplit/>
         </w:trPr>
         <w:tc>
           <w:tcPr>
@@ -6217,6 +6468,9 @@
         </w:tc>
       </w:tr>
       <w:tr>
+        <w:trPr>
+          <w:cantSplit/>
+        </w:trPr>
         <w:tc>
           <w:tcPr>
             <w:tcW w:type="dxa" w:w="3389"/>
@@ -6318,6 +6572,9 @@
         </w:tc>
       </w:tr>
       <w:tr>
+        <w:trPr>
+          <w:cantSplit/>
+        </w:trPr>
         <w:tc>
           <w:tcPr>
             <w:tcW w:type="dxa" w:w="3389"/>
@@ -6422,6 +6679,9 @@
         </w:tc>
       </w:tr>
       <w:tr>
+        <w:trPr>
+          <w:cantSplit/>
+        </w:trPr>
         <w:tc>
           <w:tcPr>
             <w:tcW w:type="dxa" w:w="3389"/>
@@ -6523,6 +6783,9 @@
         </w:tc>
       </w:tr>
       <w:tr>
+        <w:trPr>
+          <w:cantSplit/>
+        </w:trPr>
         <w:tc>
           <w:tcPr>
             <w:tcW w:type="dxa" w:w="3389"/>
@@ -6659,6 +6922,7 @@
       <w:tr>
         <w:trPr>
           <w:tblHeader w:val="true"/>
+          <w:cantSplit/>
         </w:trPr>
         <w:tc>
           <w:tcPr>
@@ -6732,6 +6996,9 @@
         </w:tc>
       </w:tr>
       <w:tr>
+        <w:trPr>
+          <w:cantSplit/>
+        </w:trPr>
         <w:tc>
           <w:tcPr>
             <w:tcW w:type="dxa" w:w="5083"/>
@@ -6800,6 +7067,9 @@
         </w:tc>
       </w:tr>
       <w:tr>
+        <w:trPr>
+          <w:cantSplit/>
+        </w:trPr>
         <w:tc>
           <w:tcPr>
             <w:tcW w:type="dxa" w:w="5083"/>
@@ -6870,6 +7140,9 @@
         </w:tc>
       </w:tr>
       <w:tr>
+        <w:trPr>
+          <w:cantSplit/>
+        </w:trPr>
         <w:tc>
           <w:tcPr>
             <w:tcW w:type="dxa" w:w="5083"/>
@@ -6938,6 +7211,9 @@
         </w:tc>
       </w:tr>
       <w:tr>
+        <w:trPr>
+          <w:cantSplit/>
+        </w:trPr>
         <w:tc>
           <w:tcPr>
             <w:tcW w:type="dxa" w:w="5083"/>
@@ -7008,6 +7284,9 @@
         </w:tc>
       </w:tr>
       <w:tr>
+        <w:trPr>
+          <w:cantSplit/>
+        </w:trPr>
         <w:tc>
           <w:tcPr>
             <w:tcW w:type="dxa" w:w="5083"/>
@@ -7076,6 +7355,9 @@
         </w:tc>
       </w:tr>
       <w:tr>
+        <w:trPr>
+          <w:cantSplit/>
+        </w:trPr>
         <w:tc>
           <w:tcPr>
             <w:tcW w:type="dxa" w:w="5083"/>
@@ -7146,6 +7428,9 @@
         </w:tc>
       </w:tr>
       <w:tr>
+        <w:trPr>
+          <w:cantSplit/>
+        </w:trPr>
         <w:tc>
           <w:tcPr>
             <w:tcW w:type="dxa" w:w="5083"/>
@@ -7214,6 +7499,9 @@
         </w:tc>
       </w:tr>
       <w:tr>
+        <w:trPr>
+          <w:cantSplit/>
+        </w:trPr>
         <w:tc>
           <w:tcPr>
             <w:tcW w:type="dxa" w:w="5083"/>
@@ -7288,6 +7576,14 @@
       <w:pPr>
         <w:spacing w:after="0"/>
       </w:pPr>
+    </w:p>
+    <w:p>
+      <w:pPr>
+        <w:pStyle w:val="Callout"/>
+      </w:pPr>
+      <w:r>
+        <w:t>Chaque projet doit porter un badge de nature de preuve : PROFESSIONAL EXPERIENCE, PERSONAL PROJECT, TRAINING PROJECT ou LAB EXPERIMENT. Cette taxonomie évite toute ambiguïté sur ce qui a été réalisé en mission, en formation ou en apprentissage personnel.</w:t>
+      </w:r>
     </w:p>
     <w:p>
       <w:r>
@@ -7374,6 +7670,7 @@
       <w:tr>
         <w:trPr>
           <w:tblHeader w:val="true"/>
+          <w:cantSplit/>
         </w:trPr>
         <w:tc>
           <w:tcPr>
@@ -7447,6 +7744,9 @@
         </w:tc>
       </w:tr>
       <w:tr>
+        <w:trPr>
+          <w:cantSplit/>
+        </w:trPr>
         <w:tc>
           <w:tcPr>
             <w:tcW w:type="dxa" w:w="5083"/>
@@ -7515,6 +7815,9 @@
         </w:tc>
       </w:tr>
       <w:tr>
+        <w:trPr>
+          <w:cantSplit/>
+        </w:trPr>
         <w:tc>
           <w:tcPr>
             <w:tcW w:type="dxa" w:w="5083"/>
@@ -7585,6 +7888,9 @@
         </w:tc>
       </w:tr>
       <w:tr>
+        <w:trPr>
+          <w:cantSplit/>
+        </w:trPr>
         <w:tc>
           <w:tcPr>
             <w:tcW w:type="dxa" w:w="5083"/>
@@ -7653,6 +7959,9 @@
         </w:tc>
       </w:tr>
       <w:tr>
+        <w:trPr>
+          <w:cantSplit/>
+        </w:trPr>
         <w:tc>
           <w:tcPr>
             <w:tcW w:type="dxa" w:w="5083"/>
@@ -7755,6 +8064,7 @@
       <w:tr>
         <w:trPr>
           <w:tblHeader w:val="true"/>
+          <w:cantSplit/>
         </w:trPr>
         <w:tc>
           <w:tcPr>
@@ -7828,6 +8138,9 @@
         </w:tc>
       </w:tr>
       <w:tr>
+        <w:trPr>
+          <w:cantSplit/>
+        </w:trPr>
         <w:tc>
           <w:tcPr>
             <w:tcW w:type="dxa" w:w="5083"/>
@@ -7896,6 +8209,9 @@
         </w:tc>
       </w:tr>
       <w:tr>
+        <w:trPr>
+          <w:cantSplit/>
+        </w:trPr>
         <w:tc>
           <w:tcPr>
             <w:tcW w:type="dxa" w:w="5083"/>
@@ -7966,6 +8282,9 @@
         </w:tc>
       </w:tr>
       <w:tr>
+        <w:trPr>
+          <w:cantSplit/>
+        </w:trPr>
         <w:tc>
           <w:tcPr>
             <w:tcW w:type="dxa" w:w="5083"/>
@@ -8034,6 +8353,9 @@
         </w:tc>
       </w:tr>
       <w:tr>
+        <w:trPr>
+          <w:cantSplit/>
+        </w:trPr>
         <w:tc>
           <w:tcPr>
             <w:tcW w:type="dxa" w:w="5083"/>
@@ -8104,6 +8426,9 @@
         </w:tc>
       </w:tr>
       <w:tr>
+        <w:trPr>
+          <w:cantSplit/>
+        </w:trPr>
         <w:tc>
           <w:tcPr>
             <w:tcW w:type="dxa" w:w="5083"/>
@@ -8172,6 +8497,9 @@
         </w:tc>
       </w:tr>
       <w:tr>
+        <w:trPr>
+          <w:cantSplit/>
+        </w:trPr>
         <w:tc>
           <w:tcPr>
             <w:tcW w:type="dxa" w:w="5083"/>
@@ -8261,6 +8589,12 @@
       </w:r>
     </w:p>
     <w:p>
+      <w:pPr/>
+      <w:r>
+        <w:t>Le mode ABOUT ME doit s’appuyer sur un corpus structuré d’expérience professionnelle, séparé des projets personnels et de la formation. Il doit pouvoir répondre précisément à “quel est son niveau de séniorité ?”, “a-t-il managé ?”, “quels contextes métier connaît-il ?” ou “a-t-il déjà travaillé professionnellement en robotique/blockchain ?” sans extrapoler.</w:t>
+      </w:r>
+    </w:p>
+    <w:p>
       <w:r>
         <w:t>L’agent doit être utile, sourcé et strictement séparé en deux modes.</w:t>
       </w:r>
@@ -8280,6 +8614,7 @@
       <w:tr>
         <w:trPr>
           <w:tblHeader w:val="true"/>
+          <w:cantSplit/>
         </w:trPr>
         <w:tc>
           <w:tcPr>
@@ -8388,6 +8723,9 @@
         </w:tc>
       </w:tr>
       <w:tr>
+        <w:trPr>
+          <w:cantSplit/>
+        </w:trPr>
         <w:tc>
           <w:tcPr>
             <w:tcW w:type="dxa" w:w="3389"/>
@@ -8489,6 +8827,9 @@
         </w:tc>
       </w:tr>
       <w:tr>
+        <w:trPr>
+          <w:cantSplit/>
+        </w:trPr>
         <w:tc>
           <w:tcPr>
             <w:tcW w:type="dxa" w:w="3389"/>
@@ -8681,8 +9022,9 @@
       </w:r>
     </w:p>
     <w:p>
+      <w:pPr/>
       <w:r>
-        <w:t>Le Skill Graph relie chaque compétence à des preuves : project, lab, note, benchmark, article, quiz ou ressource. L’IA peut ensuite proposer “What should I learn/build next?” en combinant gap, tendance et valeur marché.</w:t>
+        <w:t>Le Skill Graph relie chaque compétence à des preuves en indiquant aussi leur nature : expérience professionnelle, projet personnel, formation, Lab, benchmark, article, quiz ou ressource. L’IA peut ensuite proposer “What should I learn/build next?” sans confondre séniorité professionnelle et apprentissage émergent.</w:t>
       </w:r>
     </w:p>
     <w:p>
@@ -8707,6 +9049,7 @@
       <w:tr>
         <w:trPr>
           <w:tblHeader w:val="true"/>
+          <w:cantSplit/>
         </w:trPr>
         <w:tc>
           <w:tcPr>
@@ -8780,6 +9123,9 @@
         </w:tc>
       </w:tr>
       <w:tr>
+        <w:trPr>
+          <w:cantSplit/>
+        </w:trPr>
         <w:tc>
           <w:tcPr>
             <w:tcW w:type="dxa" w:w="5083"/>
@@ -8848,6 +9194,9 @@
         </w:tc>
       </w:tr>
       <w:tr>
+        <w:trPr>
+          <w:cantSplit/>
+        </w:trPr>
         <w:tc>
           <w:tcPr>
             <w:tcW w:type="dxa" w:w="5083"/>
@@ -8918,6 +9267,9 @@
         </w:tc>
       </w:tr>
       <w:tr>
+        <w:trPr>
+          <w:cantSplit/>
+        </w:trPr>
         <w:tc>
           <w:tcPr>
             <w:tcW w:type="dxa" w:w="5083"/>
@@ -8986,6 +9338,9 @@
         </w:tc>
       </w:tr>
       <w:tr>
+        <w:trPr>
+          <w:cantSplit/>
+        </w:trPr>
         <w:tc>
           <w:tcPr>
             <w:tcW w:type="dxa" w:w="5083"/>
@@ -9056,6 +9411,9 @@
         </w:tc>
       </w:tr>
       <w:tr>
+        <w:trPr>
+          <w:cantSplit/>
+        </w:trPr>
         <w:tc>
           <w:tcPr>
             <w:tcW w:type="dxa" w:w="5083"/>
@@ -9124,6 +9482,9 @@
         </w:tc>
       </w:tr>
       <w:tr>
+        <w:trPr>
+          <w:cantSplit/>
+        </w:trPr>
         <w:tc>
           <w:tcPr>
             <w:tcW w:type="dxa" w:w="5083"/>
@@ -9299,6 +9660,14 @@
     </w:p>
     <w:p>
       <w:pPr>
+        <w:pStyle w:val="ListBullet"/>
+      </w:pPr>
+      <w:r>
+        <w:t>Experience provenance : les affirmations de parcours doivent provenir d’une source contrôlée (CV validé / fiche expérience) et être versionnées. Une technologie apprise dans un Lab ne doit jamais apparaître automatiquement comme expérience client.</w:t>
+      </w:r>
+    </w:p>
+    <w:p>
+      <w:pPr>
         <w:pStyle w:val="Heading1"/>
       </w:pPr>
       <w:r>
@@ -9319,6 +9688,7 @@
       <w:tr>
         <w:trPr>
           <w:tblHeader w:val="true"/>
+          <w:cantSplit/>
         </w:trPr>
         <w:tc>
           <w:tcPr>
@@ -9392,6 +9762,9 @@
         </w:tc>
       </w:tr>
       <w:tr>
+        <w:trPr>
+          <w:cantSplit/>
+        </w:trPr>
         <w:tc>
           <w:tcPr>
             <w:tcW w:type="dxa" w:w="5083"/>
@@ -9460,6 +9833,9 @@
         </w:tc>
       </w:tr>
       <w:tr>
+        <w:trPr>
+          <w:cantSplit/>
+        </w:trPr>
         <w:tc>
           <w:tcPr>
             <w:tcW w:type="dxa" w:w="5083"/>
@@ -9530,6 +9906,9 @@
         </w:tc>
       </w:tr>
       <w:tr>
+        <w:trPr>
+          <w:cantSplit/>
+        </w:trPr>
         <w:tc>
           <w:tcPr>
             <w:tcW w:type="dxa" w:w="5083"/>
@@ -9598,6 +9977,9 @@
         </w:tc>
       </w:tr>
       <w:tr>
+        <w:trPr>
+          <w:cantSplit/>
+        </w:trPr>
         <w:tc>
           <w:tcPr>
             <w:tcW w:type="dxa" w:w="5083"/>
@@ -9668,6 +10050,9 @@
         </w:tc>
       </w:tr>
       <w:tr>
+        <w:trPr>
+          <w:cantSplit/>
+        </w:trPr>
         <w:tc>
           <w:tcPr>
             <w:tcW w:type="dxa" w:w="5083"/>
@@ -9736,6 +10121,9 @@
         </w:tc>
       </w:tr>
       <w:tr>
+        <w:trPr>
+          <w:cantSplit/>
+        </w:trPr>
         <w:tc>
           <w:tcPr>
             <w:tcW w:type="dxa" w:w="5083"/>
@@ -9829,8 +10217,9 @@
       </w:r>
     </w:p>
     <w:p>
+      <w:pPr/>
       <w:r>
-        <w:t>Le résultat recherché est une identité professionnelle lisible : une base Data solide qui évolue publiquement vers les systèmes agentiques et physiques, avec une méthode de travail mesurable, sourcée et utile aux autres.</w:t>
+        <w:t>Le résultat recherché est une identité professionnelle lisible : environ dix ans de pratique Data comme socle de séniorité, puis une évolution publique et vérifiable vers AI Engineering, systèmes agentiques et Physical AI. Le site doit montrer à la fois la profondeur du parcours passé et la vitesse de progression actuelle.</w:t>
       </w:r>
     </w:p>
     <w:sectPr>

</xml_diff>